<commit_message>
chore: anonymize personal domain and remove email from docs
</commit_message>
<xml_diff>
--- a/Guide_Installation_Kobo_Calibre_Browser.docx
+++ b/Guide_Installation_Kobo_Calibre_Browser.docx
@@ -340,7 +340,7 @@
                 <w:rFonts w:ascii="Calibri" w:hAnsi="Calibri"/>
                 <w:sz w:val="19"/>
               </w:rPr>
-              <w:t>https://kobo.majurel.fr</w:t>
+              <w:t>https://kobo.domain.fr</w:t>
             </w:r>
           </w:p>
         </w:tc>
@@ -414,7 +414,7 @@
                 <w:rFonts w:ascii="Calibri" w:hAnsi="Calibri"/>
                 <w:sz w:val="19"/>
               </w:rPr>
-              <w:t>https://calibre.majurel.fr</w:t>
+              <w:t>https://calibre.domain.fr</w:t>
             </w:r>
           </w:p>
         </w:tc>
@@ -562,7 +562,7 @@
                 <w:rFonts w:ascii="Calibri" w:hAnsi="Calibri"/>
                 <w:sz w:val="19"/>
               </w:rPr>
-              <w:t>https://auth.majurel.fr</w:t>
+              <w:t>https://auth.domain.fr</w:t>
             </w:r>
           </w:p>
         </w:tc>
@@ -1604,7 +1604,7 @@
           <w:color w:val="1A1A2E"/>
           <w:sz w:val="18"/>
         </w:rPr>
-        <w:t xml:space="preserve">       │  HTTPS  https://kobo.majurel.fr           │</w:t>
+        <w:t xml:space="preserve">       │  HTTPS  https://kobo.domain.fr           │</w:t>
       </w:r>
     </w:p>
     <w:p>
@@ -1821,7 +1821,7 @@
           <w:color w:val="000000"/>
           <w:sz w:val="21"/>
         </w:rPr>
-        <w:t>calibre-web est déjà déployé sur https://calibre.majurel.fr avec le Kobo Sync actif. kobo-calibre-browser lit la même bibliothèque en lecture seule — aucune action n'est nécessaire sur calibre-web, les deux services coexistent sans conflit.</w:t>
+        <w:t>calibre-web est déjà déployé sur https://calibre.domain.fr avec le Kobo Sync actif. kobo-calibre-browser lit la même bibliothèque en lecture seule — aucune action n'est nécessaire sur calibre-web, les deux services coexistent sans conflit.</w:t>
       </w:r>
     </w:p>
     <w:p>
@@ -2554,7 +2554,7 @@
           <w:color w:val="1A1A2E"/>
           <w:sz w:val="18"/>
         </w:rPr>
-        <w:t>KOBO_DOMAIN=kobo.majurel.fr</w:t>
+        <w:t>KOBO_DOMAIN=kobo.domain.fr</w:t>
       </w:r>
     </w:p>
     <w:p>
@@ -2962,7 +2962,7 @@
                 <w:rFonts w:ascii="Calibri" w:hAnsi="Calibri"/>
                 <w:sz w:val="19"/>
               </w:rPr>
-              <w:t>kobo.majurel.fr</w:t>
+              <w:t>kobo.domain.fr</w:t>
             </w:r>
           </w:p>
         </w:tc>
@@ -3782,7 +3782,7 @@
           <w:color w:val="1A1A2E"/>
           <w:sz w:val="18"/>
         </w:rPr>
-        <w:t xml:space="preserve">  - "traefik.http.routers.kobo-calibre.rule=Host(`kobo.majurel.fr`)"</w:t>
+        <w:t xml:space="preserve">  - "traefik.http.routers.kobo-calibre.rule=Host(`kobo.domain.fr`)"</w:t>
       </w:r>
     </w:p>
     <w:p>
@@ -4071,7 +4071,7 @@
           <w:rFonts w:ascii="Calibri" w:hAnsi="Calibri"/>
           <w:sz w:val="21"/>
         </w:rPr>
-        <w:t>Accéder au tableau de bord Traefik (ex: https://traefik.majurel.fr)</w:t>
+        <w:t>Accéder au tableau de bord Traefik (ex: https://traefik.domain.fr)</w:t>
       </w:r>
     </w:p>
     <w:p>
@@ -4352,7 +4352,7 @@
           <w:color w:val="1A1A2E"/>
           <w:sz w:val="18"/>
         </w:rPr>
-        <w:t xml:space="preserve">    - domain: kobo.majurel.fr</w:t>
+        <w:t xml:space="preserve">    - domain: kobo.domain.fr</w:t>
       </w:r>
     </w:p>
     <w:p>
@@ -5132,7 +5132,7 @@
           <w:color w:val="000000"/>
           <w:sz w:val="21"/>
         </w:rPr>
-        <w:t>Le sous-domaine kobo.majurel.fr doit pointer vers le serveur Unraid (ou vers le reverse proxy qui reçoit les connexions entrantes).</w:t>
+        <w:t>Le sous-domaine kobo.domain.fr doit pointer vers le serveur Unraid (ou vers le reverse proxy qui reçoit les connexions entrantes).</w:t>
       </w:r>
     </w:p>
     <w:p>
@@ -5415,7 +5415,7 @@
                 <w:rFonts w:ascii="Calibri" w:hAnsi="Calibri"/>
                 <w:sz w:val="19"/>
               </w:rPr>
-              <w:t>majurel.fr  (si IP déjà sur le domaine racine)</w:t>
+              <w:t>domain.fr  (si IP déjà sur le domaine racine)</w:t>
             </w:r>
           </w:p>
         </w:tc>
@@ -5475,7 +5475,7 @@
           <w:color w:val="000000"/>
           <w:sz w:val="21"/>
         </w:rPr>
-        <w:t>Si majurel.fr est géré par Cloudflare, ajouter le sous-domaine dans le dashboard :</w:t>
+        <w:t>Si domain.fr est géré par Cloudflare, ajouter le sous-domaine dans le dashboard :</w:t>
       </w:r>
     </w:p>
     <w:p>
@@ -5501,7 +5501,7 @@
           <w:rFonts w:ascii="Calibri" w:hAnsi="Calibri"/>
           <w:sz w:val="21"/>
         </w:rPr>
-        <w:t>Sélectionner le domaine majurel.fr</w:t>
+        <w:t>Sélectionner le domaine domain.fr</w:t>
       </w:r>
     </w:p>
     <w:p>
@@ -5640,7 +5640,7 @@
           <w:color w:val="1A1A2E"/>
           <w:sz w:val="18"/>
         </w:rPr>
-        <w:t>nslookup kobo.majurel.fr</w:t>
+        <w:t>nslookup kobo.domain.fr</w:t>
       </w:r>
     </w:p>
     <w:p>
@@ -5700,7 +5700,7 @@
           <w:color w:val="1A1A2E"/>
           <w:sz w:val="18"/>
         </w:rPr>
-        <w:t># Name:    kobo.majurel.fr</w:t>
+        <w:t># Name:    kobo.domain.fr</w:t>
       </w:r>
     </w:p>
     <w:p>
@@ -5760,7 +5760,7 @@
           <w:color w:val="1A1A2E"/>
           <w:sz w:val="18"/>
         </w:rPr>
-        <w:t>curl -I https://kobo.majurel.fr/health</w:t>
+        <w:t>curl -I https://kobo.domain.fr/health</w:t>
       </w:r>
     </w:p>
     <w:p>
@@ -5939,7 +5939,7 @@
           <w:color w:val="1A1A2E"/>
           <w:sz w:val="18"/>
         </w:rPr>
-        <w:t>https://kobo.majurel.fr</w:t>
+        <w:t>https://kobo.domain.fr</w:t>
       </w:r>
     </w:p>
     <w:p>
@@ -5998,7 +5998,7 @@
           <w:rFonts w:ascii="Calibri" w:hAnsi="Calibri"/>
           <w:sz w:val="21"/>
         </w:rPr>
-        <w:t>Une fois sur https://kobo.majurel.fr, appuyer sur l'icône étoile dans la barre d'adresse</w:t>
+        <w:t>Une fois sur https://kobo.domain.fr, appuyer sur l'icône étoile dans la barre d'adresse</w:t>
       </w:r>
     </w:p>
     <w:p>
@@ -6725,7 +6725,7 @@
           <w:color w:val="444444"/>
           <w:sz w:val="20"/>
         </w:rPr>
-        <w:t>nslookup kobo.majurel.fr  →  retourne l'IP correcte</w:t>
+        <w:t>nslookup kobo.domain.fr  →  retourne l'IP correcte</w:t>
       </w:r>
     </w:p>
     <w:p>
@@ -6754,7 +6754,7 @@
           <w:color w:val="444444"/>
           <w:sz w:val="20"/>
         </w:rPr>
-        <w:t>curl -I https://kobo.majurel.fr  →  HTTP/2 200 ou 302</w:t>
+        <w:t>curl -I https://kobo.domain.fr  →  HTTP/2 200 ou 302</w:t>
       </w:r>
     </w:p>
     <w:p>
@@ -6783,7 +6783,7 @@
           <w:color w:val="444444"/>
           <w:sz w:val="20"/>
         </w:rPr>
-        <w:t>Naviguer vers https://kobo.majurel.fr  →  page de login Authelia</w:t>
+        <w:t>Naviguer vers https://kobo.domain.fr  →  page de login Authelia</w:t>
       </w:r>
     </w:p>
     <w:p>
@@ -6928,7 +6928,7 @@
           <w:color w:val="444444"/>
           <w:sz w:val="20"/>
         </w:rPr>
-        <w:t>Naviguer vers https://kobo.majurel.fr depuis le navigateur Kobo</w:t>
+        <w:t>Naviguer vers https://kobo.domain.fr depuis le navigateur Kobo</w:t>
       </w:r>
     </w:p>
     <w:p>
@@ -7021,7 +7021,7 @@
           <w:rFonts w:ascii="Calibri" w:hAnsi="Calibri"/>
           <w:sz w:val="21"/>
         </w:rPr>
-        <w:t>Naviguer vers https://kobo.majurel.fr</w:t>
+        <w:t>Naviguer vers https://kobo.domain.fr</w:t>
       </w:r>
     </w:p>
     <w:p>
@@ -7295,7 +7295,7 @@
                 <w:rFonts w:ascii="Calibri" w:hAnsi="Calibri"/>
                 <w:sz w:val="19"/>
               </w:rPr>
-              <w:t>404 sur kobo.majurel.fr</w:t>
+              <w:t>404 sur kobo.domain.fr</w:t>
             </w:r>
           </w:p>
         </w:tc>
@@ -7491,7 +7491,7 @@
                 <w:rFonts w:ascii="Calibri" w:hAnsi="Calibri"/>
                 <w:sz w:val="19"/>
               </w:rPr>
-              <w:t>Vérifier que le domaine Authelia et kobo.majurel.fr sont sur le même domaine parent</w:t>
+              <w:t>Vérifier que le domaine Authelia et kobo.domain.fr sont sur le même domaine parent</w:t>
             </w:r>
           </w:p>
         </w:tc>
@@ -8148,7 +8148,7 @@
         <w:color w:val="888888"/>
         <w:sz w:val="16"/>
       </w:rPr>
-      <w:t>Kobo Calibre Browser — Guide d'installation v1.0  ·  fabien.majurel@outlook.com</w:t>
+      <w:t xml:space="preserve">Kobo Calibre Browser — Guide d'installation v1.0  ·  </w:t>
     </w:r>
   </w:p>
 </w:ftr>

</xml_diff>